<commit_message>
final update for submission
title
</commit_message>
<xml_diff>
--- a/ICT50220-ICTPRG532-STUDENT-AT2-SAC-V1.docx
+++ b/ICT50220-ICTPRG532-STUDENT-AT2-SAC-V1.docx
@@ -3095,6 +3095,226 @@
     </w:p>
     <w:p>
       <w:pPr>
+        <w:spacing w:before="200"/>
+        <w:jc w:val="center"/>
+        <w:rPr>
+          <w:b/>
+          <w:bCs/>
+        </w:rPr>
+      </w:pPr>
+      <w:r>
+        <w:rPr>
+          <w:b/>
+          <w:bCs/>
+        </w:rPr>
+        <w:lastRenderedPageBreak/>
+        <w:drawing>
+          <wp:inline distT="0" distB="0" distL="0" distR="0" wp14:anchorId="423FE85E" wp14:editId="631FCF7E">
+            <wp:extent cx="6479540" cy="7326630"/>
+            <wp:effectExtent l="0" t="0" r="0" b="7620"/>
+            <wp:docPr id="802722758" name="Picture 1"/>
+            <wp:cNvGraphicFramePr>
+              <a:graphicFrameLocks xmlns:a="http://schemas.openxmlformats.org/drawingml/2006/main" noChangeAspect="1"/>
+            </wp:cNvGraphicFramePr>
+            <a:graphic xmlns:a="http://schemas.openxmlformats.org/drawingml/2006/main">
+              <a:graphicData uri="http://schemas.openxmlformats.org/drawingml/2006/picture">
+                <pic:pic xmlns:pic="http://schemas.openxmlformats.org/drawingml/2006/picture">
+                  <pic:nvPicPr>
+                    <pic:cNvPr id="802722758" name=""/>
+                    <pic:cNvPicPr/>
+                  </pic:nvPicPr>
+                  <pic:blipFill>
+                    <a:blip r:embed="rId12"/>
+                    <a:stretch>
+                      <a:fillRect/>
+                    </a:stretch>
+                  </pic:blipFill>
+                  <pic:spPr>
+                    <a:xfrm>
+                      <a:off x="0" y="0"/>
+                      <a:ext cx="6479540" cy="7326630"/>
+                    </a:xfrm>
+                    <a:prstGeom prst="rect">
+                      <a:avLst/>
+                    </a:prstGeom>
+                  </pic:spPr>
+                </pic:pic>
+              </a:graphicData>
+            </a:graphic>
+          </wp:inline>
+        </w:drawing>
+      </w:r>
+      <w:r>
+        <w:rPr>
+          <w:b/>
+          <w:bCs/>
+        </w:rPr>
+        <w:lastRenderedPageBreak/>
+        <w:drawing>
+          <wp:inline distT="0" distB="0" distL="0" distR="0" wp14:anchorId="29C60312" wp14:editId="672349B7">
+            <wp:extent cx="6479540" cy="6409055"/>
+            <wp:effectExtent l="0" t="0" r="0" b="0"/>
+            <wp:docPr id="906787244" name="Picture 1"/>
+            <wp:cNvGraphicFramePr>
+              <a:graphicFrameLocks xmlns:a="http://schemas.openxmlformats.org/drawingml/2006/main" noChangeAspect="1"/>
+            </wp:cNvGraphicFramePr>
+            <a:graphic xmlns:a="http://schemas.openxmlformats.org/drawingml/2006/main">
+              <a:graphicData uri="http://schemas.openxmlformats.org/drawingml/2006/picture">
+                <pic:pic xmlns:pic="http://schemas.openxmlformats.org/drawingml/2006/picture">
+                  <pic:nvPicPr>
+                    <pic:cNvPr id="906787244" name=""/>
+                    <pic:cNvPicPr/>
+                  </pic:nvPicPr>
+                  <pic:blipFill>
+                    <a:blip r:embed="rId13"/>
+                    <a:stretch>
+                      <a:fillRect/>
+                    </a:stretch>
+                  </pic:blipFill>
+                  <pic:spPr>
+                    <a:xfrm>
+                      <a:off x="0" y="0"/>
+                      <a:ext cx="6479540" cy="6409055"/>
+                    </a:xfrm>
+                    <a:prstGeom prst="rect">
+                      <a:avLst/>
+                    </a:prstGeom>
+                  </pic:spPr>
+                </pic:pic>
+              </a:graphicData>
+            </a:graphic>
+          </wp:inline>
+        </w:drawing>
+      </w:r>
+      <w:r>
+        <w:rPr>
+          <w:b/>
+          <w:bCs/>
+        </w:rPr>
+        <w:lastRenderedPageBreak/>
+        <w:drawing>
+          <wp:inline distT="0" distB="0" distL="0" distR="0" wp14:anchorId="4273E82B" wp14:editId="48763828">
+            <wp:extent cx="6479540" cy="5285105"/>
+            <wp:effectExtent l="0" t="0" r="0" b="0"/>
+            <wp:docPr id="270716111" name="Picture 1"/>
+            <wp:cNvGraphicFramePr>
+              <a:graphicFrameLocks xmlns:a="http://schemas.openxmlformats.org/drawingml/2006/main" noChangeAspect="1"/>
+            </wp:cNvGraphicFramePr>
+            <a:graphic xmlns:a="http://schemas.openxmlformats.org/drawingml/2006/main">
+              <a:graphicData uri="http://schemas.openxmlformats.org/drawingml/2006/picture">
+                <pic:pic xmlns:pic="http://schemas.openxmlformats.org/drawingml/2006/picture">
+                  <pic:nvPicPr>
+                    <pic:cNvPr id="270716111" name=""/>
+                    <pic:cNvPicPr/>
+                  </pic:nvPicPr>
+                  <pic:blipFill>
+                    <a:blip r:embed="rId14"/>
+                    <a:stretch>
+                      <a:fillRect/>
+                    </a:stretch>
+                  </pic:blipFill>
+                  <pic:spPr>
+                    <a:xfrm>
+                      <a:off x="0" y="0"/>
+                      <a:ext cx="6479540" cy="5285105"/>
+                    </a:xfrm>
+                    <a:prstGeom prst="rect">
+                      <a:avLst/>
+                    </a:prstGeom>
+                  </pic:spPr>
+                </pic:pic>
+              </a:graphicData>
+            </a:graphic>
+          </wp:inline>
+        </w:drawing>
+      </w:r>
+      <w:r>
+        <w:rPr>
+          <w:b/>
+          <w:bCs/>
+        </w:rPr>
+        <w:lastRenderedPageBreak/>
+        <w:drawing>
+          <wp:inline distT="0" distB="0" distL="0" distR="0" wp14:anchorId="38B58A39" wp14:editId="195A65A6">
+            <wp:extent cx="6479540" cy="5770880"/>
+            <wp:effectExtent l="0" t="0" r="0" b="1270"/>
+            <wp:docPr id="1120218704" name="Picture 1"/>
+            <wp:cNvGraphicFramePr>
+              <a:graphicFrameLocks xmlns:a="http://schemas.openxmlformats.org/drawingml/2006/main" noChangeAspect="1"/>
+            </wp:cNvGraphicFramePr>
+            <a:graphic xmlns:a="http://schemas.openxmlformats.org/drawingml/2006/main">
+              <a:graphicData uri="http://schemas.openxmlformats.org/drawingml/2006/picture">
+                <pic:pic xmlns:pic="http://schemas.openxmlformats.org/drawingml/2006/picture">
+                  <pic:nvPicPr>
+                    <pic:cNvPr id="1120218704" name=""/>
+                    <pic:cNvPicPr/>
+                  </pic:nvPicPr>
+                  <pic:blipFill>
+                    <a:blip r:embed="rId15"/>
+                    <a:stretch>
+                      <a:fillRect/>
+                    </a:stretch>
+                  </pic:blipFill>
+                  <pic:spPr>
+                    <a:xfrm>
+                      <a:off x="0" y="0"/>
+                      <a:ext cx="6479540" cy="5770880"/>
+                    </a:xfrm>
+                    <a:prstGeom prst="rect">
+                      <a:avLst/>
+                    </a:prstGeom>
+                  </pic:spPr>
+                </pic:pic>
+              </a:graphicData>
+            </a:graphic>
+          </wp:inline>
+        </w:drawing>
+      </w:r>
+      <w:r>
+        <w:rPr>
+          <w:b/>
+          <w:bCs/>
+        </w:rPr>
+        <w:lastRenderedPageBreak/>
+        <w:drawing>
+          <wp:inline distT="0" distB="0" distL="0" distR="0" wp14:anchorId="64A44C9A" wp14:editId="094E9798">
+            <wp:extent cx="6479540" cy="4857750"/>
+            <wp:effectExtent l="0" t="0" r="0" b="0"/>
+            <wp:docPr id="2109910575" name="Picture 1"/>
+            <wp:cNvGraphicFramePr>
+              <a:graphicFrameLocks xmlns:a="http://schemas.openxmlformats.org/drawingml/2006/main" noChangeAspect="1"/>
+            </wp:cNvGraphicFramePr>
+            <a:graphic xmlns:a="http://schemas.openxmlformats.org/drawingml/2006/main">
+              <a:graphicData uri="http://schemas.openxmlformats.org/drawingml/2006/picture">
+                <pic:pic xmlns:pic="http://schemas.openxmlformats.org/drawingml/2006/picture">
+                  <pic:nvPicPr>
+                    <pic:cNvPr id="2109910575" name=""/>
+                    <pic:cNvPicPr/>
+                  </pic:nvPicPr>
+                  <pic:blipFill>
+                    <a:blip r:embed="rId16"/>
+                    <a:stretch>
+                      <a:fillRect/>
+                    </a:stretch>
+                  </pic:blipFill>
+                  <pic:spPr>
+                    <a:xfrm>
+                      <a:off x="0" y="0"/>
+                      <a:ext cx="6479540" cy="4857750"/>
+                    </a:xfrm>
+                    <a:prstGeom prst="rect">
+                      <a:avLst/>
+                    </a:prstGeom>
+                  </pic:spPr>
+                </pic:pic>
+              </a:graphicData>
+            </a:graphic>
+          </wp:inline>
+        </w:drawing>
+      </w:r>
+    </w:p>
+    <w:p>
+      <w:pPr>
         <w:pStyle w:val="CITHeading2"/>
         <w:shd w:val="clear" w:color="auto" w:fill="54C3BD"/>
         <w:jc w:val="center"/>
@@ -3289,6 +3509,7 @@
           <w:sz w:val="28"/>
           <w:szCs w:val="28"/>
         </w:rPr>
+        <w:lastRenderedPageBreak/>
         <w:t xml:space="preserve">Question </w:t>
       </w:r>
       <w:r>
@@ -3306,7 +3527,6 @@
         <w:spacing w:before="200"/>
       </w:pPr>
       <w:r>
-        <w:lastRenderedPageBreak/>
         <w:t>In the table, identify at least two of the design principles discussed in Session 4 that you used for this assessment, and how you implemented those design principles.</w:t>
       </w:r>
     </w:p>
@@ -3361,6 +3581,13 @@
                 <w:bCs/>
               </w:rPr>
             </w:pPr>
+            <w:r>
+              <w:rPr>
+                <w:b/>
+                <w:bCs/>
+              </w:rPr>
+              <w:t>Encapsulation</w:t>
+            </w:r>
           </w:p>
         </w:tc>
         <w:tc>
@@ -3376,6 +3603,13 @@
                 <w:bCs/>
               </w:rPr>
             </w:pPr>
+            <w:r>
+              <w:rPr>
+                <w:b/>
+                <w:bCs/>
+              </w:rPr>
+              <w:t>Separation of concerns</w:t>
+            </w:r>
           </w:p>
         </w:tc>
       </w:tr>
@@ -3419,6 +3653,13 @@
                 <w:bCs/>
               </w:rPr>
             </w:pPr>
+            <w:r>
+              <w:rPr>
+                <w:b/>
+                <w:bCs/>
+              </w:rPr>
+              <w:t>Encapsulation was used by keeping data and related methods inside classes such as Car and Engine. The internal details are hidden, and the form interacts only through public methods like GetDetails().</w:t>
+            </w:r>
           </w:p>
         </w:tc>
         <w:tc>
@@ -3434,6 +3675,13 @@
                 <w:bCs/>
               </w:rPr>
             </w:pPr>
+            <w:r>
+              <w:rPr>
+                <w:b/>
+                <w:bCs/>
+              </w:rPr>
+              <w:t>Each feature of the program is placed in a separate form (Task A–D), so each form handles only one responsibility. This keeps the code organised and easier to manage.</w:t>
+            </w:r>
           </w:p>
         </w:tc>
       </w:tr>
@@ -3572,6 +3820,9 @@
             <w:pPr>
               <w:spacing w:before="60" w:after="60" w:line="259" w:lineRule="auto"/>
             </w:pPr>
+            <w:r>
+              <w:t>UI code is kept separate from logic by using different forms and methods for processing tasks. This prevents business logic from being mixed directly into interface code.</w:t>
+            </w:r>
           </w:p>
         </w:tc>
       </w:tr>
@@ -3611,6 +3862,9 @@
             <w:pPr>
               <w:spacing w:before="60" w:after="60" w:line="259" w:lineRule="auto"/>
             </w:pPr>
+            <w:r>
+              <w:t>The application is split into multiple forms and small classes like Node, Car, and Engine. Each class only handles one responsibility, avoiding oversized classes.</w:t>
+            </w:r>
           </w:p>
         </w:tc>
       </w:tr>
@@ -3650,6 +3904,9 @@
             <w:pPr>
               <w:spacing w:before="60" w:after="60" w:line="259" w:lineRule="auto"/>
             </w:pPr>
+            <w:r>
+              <w:t>Basic validation such as checking empty inputs and using int.TryParse() is used to prevent crashes. This ensures the program handles invalid user input safely.</w:t>
+            </w:r>
           </w:p>
         </w:tc>
       </w:tr>
@@ -3689,6 +3946,9 @@
             <w:pPr>
               <w:spacing w:before="60" w:after="60" w:line="259" w:lineRule="auto"/>
             </w:pPr>
+            <w:r>
+              <w:t>The program uses clear naming conventions and comments to explain key logic. Splitting the program into multiple forms also improves readability.</w:t>
+            </w:r>
           </w:p>
         </w:tc>
       </w:tr>
@@ -5189,12 +5449,12 @@
       </w:pPr>
     </w:p>
     <w:sectPr>
-      <w:headerReference w:type="even" r:id="rId12"/>
-      <w:headerReference w:type="default" r:id="rId13"/>
-      <w:footerReference w:type="even" r:id="rId14"/>
-      <w:footerReference w:type="default" r:id="rId15"/>
-      <w:headerReference w:type="first" r:id="rId16"/>
-      <w:footerReference w:type="first" r:id="rId17"/>
+      <w:headerReference w:type="even" r:id="rId17"/>
+      <w:headerReference w:type="default" r:id="rId18"/>
+      <w:footerReference w:type="even" r:id="rId19"/>
+      <w:footerReference w:type="default" r:id="rId20"/>
+      <w:headerReference w:type="first" r:id="rId21"/>
+      <w:footerReference w:type="first" r:id="rId22"/>
       <w:pgSz w:w="11906" w:h="16838"/>
       <w:pgMar w:top="851" w:right="851" w:bottom="851" w:left="851" w:header="709" w:footer="283" w:gutter="0"/>
       <w:cols w:space="708"/>
@@ -9689,7 +9949,6 @@
   <w:style w:type="character" w:default="1" w:styleId="DefaultParagraphFont">
     <w:name w:val="Default Paragraph Font"/>
     <w:uiPriority w:val="1"/>
-    <w:semiHidden/>
     <w:unhideWhenUsed/>
   </w:style>
   <w:style w:type="table" w:default="1" w:styleId="TableNormal">
@@ -10563,6 +10822,30 @@
 </file>
 
 <file path=customXml/item1.xml><?xml version="1.0" encoding="utf-8"?>
+<?mso-contentType ?>
+<FormTemplates xmlns="http://schemas.microsoft.com/sharepoint/v3/contenttype/forms">
+  <Display>DocumentLibraryForm</Display>
+  <Edit>DocumentLibraryForm</Edit>
+  <New>DocumentLibraryForm</New>
+</FormTemplates>
+</file>
+
+<file path=customXml/item2.xml><?xml version="1.0" encoding="utf-8"?>
+<p:properties xmlns:p="http://schemas.microsoft.com/office/2006/metadata/properties" xmlns:xsi="http://www.w3.org/2001/XMLSchema-instance" xmlns:pc="http://schemas.microsoft.com/office/infopath/2007/PartnerControls">
+  <documentManagement>
+    <TaxCatchAll xmlns="d1a5cebd-f98a-4329-8a90-e6e73a3e93e5" xsi:nil="true"/>
+    <lcf76f155ced4ddcb4097134ff3c332f xmlns="f4709820-67c1-4d5a-be14-b5896dfeebbd">
+      <Terms xmlns="http://schemas.microsoft.com/office/infopath/2007/PartnerControls"/>
+    </lcf76f155ced4ddcb4097134ff3c332f>
+  </documentManagement>
+</p:properties>
+</file>
+
+<file path=customXml/item3.xml><?xml version="1.0" encoding="utf-8"?>
+<b:Sources xmlns:b="http://schemas.openxmlformats.org/officeDocument/2006/bibliography" xmlns="http://schemas.openxmlformats.org/officeDocument/2006/bibliography" SelectedStyle="\APASixthEditionOfficeOnline.xsl" StyleName="APA" Version="6"/>
+</file>
+
+<file path=customXml/item4.xml><?xml version="1.0" encoding="utf-8"?>
 <ct:contentTypeSchema xmlns:ct="http://schemas.microsoft.com/office/2006/metadata/contentType" xmlns:ma="http://schemas.microsoft.com/office/2006/metadata/properties/metaAttributes" ct:_="" ma:_="" ma:contentTypeName="Document" ma:contentTypeID="0x010100786A80822C0C5C419EDA47081634B666" ma:contentTypeVersion="17" ma:contentTypeDescription="Create a new document." ma:contentTypeScope="" ma:versionID="fc0250da191ca4fa615dd8b067976613">
   <xsd:schema xmlns:xsd="http://www.w3.org/2001/XMLSchema" xmlns:xs="http://www.w3.org/2001/XMLSchema" xmlns:p="http://schemas.microsoft.com/office/2006/metadata/properties" xmlns:ns2="f4709820-67c1-4d5a-be14-b5896dfeebbd" xmlns:ns3="d1a5cebd-f98a-4329-8a90-e6e73a3e93e5" targetNamespace="http://schemas.microsoft.com/office/2006/metadata/properties" ma:root="true" ma:fieldsID="92b971f136c4eecc4133f5ac155419bb" ns2:_="" ns3:_="">
     <xsd:import namespace="f4709820-67c1-4d5a-be14-b5896dfeebbd"/>
@@ -10811,31 +11094,34 @@
 </ct:contentTypeSchema>
 </file>
 
-<file path=customXml/item2.xml><?xml version="1.0" encoding="utf-8"?>
-<b:Sources xmlns:b="http://schemas.openxmlformats.org/officeDocument/2006/bibliography" xmlns="http://schemas.openxmlformats.org/officeDocument/2006/bibliography" SelectedStyle="\APASixthEditionOfficeOnline.xsl" StyleName="APA" Version="6"/>
+<file path=customXml/itemProps1.xml><?xml version="1.0" encoding="utf-8"?>
+<ds:datastoreItem xmlns:ds="http://schemas.openxmlformats.org/officeDocument/2006/customXml" ds:itemID="{44D0AA14-CC67-4521-A568-3BB47FD3F5C8}">
+  <ds:schemaRefs>
+    <ds:schemaRef ds:uri="http://schemas.microsoft.com/sharepoint/v3/contenttype/forms"/>
+  </ds:schemaRefs>
+</ds:datastoreItem>
 </file>
 
-<file path=customXml/item3.xml><?xml version="1.0" encoding="utf-8"?>
-<p:properties xmlns:p="http://schemas.microsoft.com/office/2006/metadata/properties" xmlns:xsi="http://www.w3.org/2001/XMLSchema-instance" xmlns:pc="http://schemas.microsoft.com/office/infopath/2007/PartnerControls">
-  <documentManagement>
-    <TaxCatchAll xmlns="d1a5cebd-f98a-4329-8a90-e6e73a3e93e5" xsi:nil="true"/>
-    <lcf76f155ced4ddcb4097134ff3c332f xmlns="f4709820-67c1-4d5a-be14-b5896dfeebbd">
-      <Terms xmlns="http://schemas.microsoft.com/office/infopath/2007/PartnerControls"/>
-    </lcf76f155ced4ddcb4097134ff3c332f>
-  </documentManagement>
-</p:properties>
+<file path=customXml/itemProps2.xml><?xml version="1.0" encoding="utf-8"?>
+<ds:datastoreItem xmlns:ds="http://schemas.openxmlformats.org/officeDocument/2006/customXml" ds:itemID="{33E7C365-5AFC-463D-B59E-3B741D889FF6}">
+  <ds:schemaRefs>
+    <ds:schemaRef ds:uri="http://schemas.microsoft.com/office/2006/metadata/properties"/>
+    <ds:schemaRef ds:uri="http://schemas.microsoft.com/office/infopath/2007/PartnerControls"/>
+    <ds:schemaRef ds:uri="d1a5cebd-f98a-4329-8a90-e6e73a3e93e5"/>
+    <ds:schemaRef ds:uri="f4709820-67c1-4d5a-be14-b5896dfeebbd"/>
+  </ds:schemaRefs>
+</ds:datastoreItem>
 </file>
 
-<file path=customXml/item4.xml><?xml version="1.0" encoding="utf-8"?>
-<?mso-contentType ?>
-<FormTemplates xmlns="http://schemas.microsoft.com/sharepoint/v3/contenttype/forms">
-  <Display>DocumentLibraryForm</Display>
-  <Edit>DocumentLibraryForm</Edit>
-  <New>DocumentLibraryForm</New>
-</FormTemplates>
+<file path=customXml/itemProps3.xml><?xml version="1.0" encoding="utf-8"?>
+<ds:datastoreItem xmlns:ds="http://schemas.openxmlformats.org/officeDocument/2006/customXml" ds:itemID="{B03C4B90-032C-4261-BEA3-3DD861B79FF7}">
+  <ds:schemaRefs>
+    <ds:schemaRef ds:uri="http://schemas.openxmlformats.org/officeDocument/2006/bibliography"/>
+  </ds:schemaRefs>
+</ds:datastoreItem>
 </file>
 
-<file path=customXml/itemProps1.xml><?xml version="1.0" encoding="utf-8"?>
+<file path=customXml/itemProps4.xml><?xml version="1.0" encoding="utf-8"?>
 <ds:datastoreItem xmlns:ds="http://schemas.openxmlformats.org/officeDocument/2006/customXml" ds:itemID="{4D8EB46B-BE86-4BA8-95AB-9CEC6BC74076}">
   <ds:schemaRefs>
     <ds:schemaRef ds:uri="http://schemas.microsoft.com/office/2006/metadata/contentType"/>
@@ -10852,31 +11138,4 @@
     <ds:schemaRef ds:uri="http://schemas.microsoft.com/internal/obd"/>
   </ds:schemaRefs>
 </ds:datastoreItem>
-</file>
-
-<file path=customXml/itemProps2.xml><?xml version="1.0" encoding="utf-8"?>
-<ds:datastoreItem xmlns:ds="http://schemas.openxmlformats.org/officeDocument/2006/customXml" ds:itemID="{B03C4B90-032C-4261-BEA3-3DD861B79FF7}">
-  <ds:schemaRefs>
-    <ds:schemaRef ds:uri="http://schemas.openxmlformats.org/officeDocument/2006/bibliography"/>
-  </ds:schemaRefs>
-</ds:datastoreItem>
-</file>
-
-<file path=customXml/itemProps3.xml><?xml version="1.0" encoding="utf-8"?>
-<ds:datastoreItem xmlns:ds="http://schemas.openxmlformats.org/officeDocument/2006/customXml" ds:itemID="{33E7C365-5AFC-463D-B59E-3B741D889FF6}">
-  <ds:schemaRefs>
-    <ds:schemaRef ds:uri="http://schemas.microsoft.com/office/2006/metadata/properties"/>
-    <ds:schemaRef ds:uri="http://schemas.microsoft.com/office/infopath/2007/PartnerControls"/>
-    <ds:schemaRef ds:uri="d1a5cebd-f98a-4329-8a90-e6e73a3e93e5"/>
-    <ds:schemaRef ds:uri="f4709820-67c1-4d5a-be14-b5896dfeebbd"/>
-  </ds:schemaRefs>
-</ds:datastoreItem>
-</file>
-
-<file path=customXml/itemProps4.xml><?xml version="1.0" encoding="utf-8"?>
-<ds:datastoreItem xmlns:ds="http://schemas.openxmlformats.org/officeDocument/2006/customXml" ds:itemID="{44D0AA14-CC67-4521-A568-3BB47FD3F5C8}">
-  <ds:schemaRefs>
-    <ds:schemaRef ds:uri="http://schemas.microsoft.com/sharepoint/v3/contenttype/forms"/>
-  </ds:schemaRefs>
-</ds:datastoreItem>
 </file>
</xml_diff>